<commit_message>
Expand ULAplus palette user documentation
</commit_message>
<xml_diff>
--- a/docs/2068_Leap_Users_Manual.docx
+++ b/docs/2068_Leap_Users_Manual.docx
@@ -4399,6 +4399,110 @@
           </w:p>
         </w:tc>
       </w:tr>
+      <w:tr>
+        <w:tc>
+          <w:tcPr>
+            <w:tcW w:type="dxa" w:w="5040"/>
+          </w:tcPr>
+          <w:p>
+            <w:r/>
+            <w:r>
+              <w:rPr>
+                <w:rStyle w:val="CodeInline"/>
+              </w:rPr>
+              <w:t>ULAPLUS n</w:t>
+            </w:r>
+            <w:r/>
+          </w:p>
+        </w:tc>
+        <w:tc>
+          <w:tcPr>
+            <w:tcW w:type="dxa" w:w="5040"/>
+          </w:tcPr>
+          <w:p>
+            <w:r>
+              <w:t>Enable (</w:t>
+            </w:r>
+            <w:r>
+              <w:rPr>
+                <w:rStyle w:val="CodeInline"/>
+              </w:rPr>
+              <w:t>1</w:t>
+            </w:r>
+            <w:r>
+              <w:t>) or disable (</w:t>
+            </w:r>
+            <w:r>
+              <w:rPr>
+                <w:rStyle w:val="CodeInline"/>
+              </w:rPr>
+              <w:t>0</w:t>
+            </w:r>
+            <w:r>
+              <w:t xml:space="preserve">) the ULAplus extended palette. Other values raise </w:t>
+            </w:r>
+            <w:r>
+              <w:rPr>
+                <w:rStyle w:val="CodeInline"/>
+              </w:rPr>
+              <w:t>INVALID ARGUMENT</w:t>
+            </w:r>
+            <w:r/>
+          </w:p>
+        </w:tc>
+      </w:tr>
+      <w:tr>
+        <w:tc>
+          <w:tcPr>
+            <w:tcW w:type="dxa" w:w="5040"/>
+          </w:tcPr>
+          <w:p>
+            <w:r/>
+            <w:r>
+              <w:rPr>
+                <w:rStyle w:val="CodeInline"/>
+              </w:rPr>
+              <w:t>PALETTE index,value</w:t>
+            </w:r>
+            <w:r/>
+          </w:p>
+        </w:tc>
+        <w:tc>
+          <w:tcPr>
+            <w:tcW w:type="dxa" w:w="5040"/>
+          </w:tcPr>
+          <w:p>
+            <w:r>
+              <w:t xml:space="preserve">Program ULAplus register </w:t>
+            </w:r>
+            <w:r>
+              <w:rPr>
+                <w:rStyle w:val="CodeInline"/>
+              </w:rPr>
+              <w:t>index</w:t>
+            </w:r>
+            <w:r>
+              <w:t xml:space="preserve"> (0-63) with an 8-bit </w:t>
+            </w:r>
+            <w:r>
+              <w:rPr>
+                <w:rStyle w:val="CodeInline"/>
+              </w:rPr>
+              <w:t>GGGRRRBB</w:t>
+            </w:r>
+            <w:r>
+              <w:t xml:space="preserve"> colour value (0-255). Out-of-range arguments raise </w:t>
+            </w:r>
+            <w:r>
+              <w:rPr>
+                <w:rStyle w:val="CodeInline"/>
+              </w:rPr>
+              <w:t>INVALID ARGUMENT</w:t>
+            </w:r>
+            <w:r/>
+          </w:p>
+        </w:tc>
+      </w:tr>
     </w:tbl>
     <w:p>
       <w:r/>
@@ -4545,6 +4649,176 @@
       </w:r>
       <w:r>
         <w:t xml:space="preserve"> clears it again) — useful for drawing something temporarily without needing to remember and redraw whatever was underneath it.</w:t>
+      </w:r>
+    </w:p>
+    <w:p>
+      <w:pPr>
+        <w:pStyle w:val="Heading3"/>
+      </w:pPr>
+      <w:r>
+        <w:t>ULAplus palettes</w:t>
+      </w:r>
+    </w:p>
+    <w:p>
+      <w:r>
+        <w:t xml:space="preserve">ULAplus provides 64 programmable colours. Select a palette register with an index from 0 through 63, then give it an 8-bit colour value in </w:t>
+      </w:r>
+      <w:r>
+        <w:rPr>
+          <w:rStyle w:val="CodeInline"/>
+        </w:rPr>
+        <w:t>GGGRRRBB</w:t>
+      </w:r>
+      <w:r>
+        <w:t xml:space="preserve"> format:</w:t>
+      </w:r>
+    </w:p>
+    <w:p>
+      <w:pPr>
+        <w:pStyle w:val="ListBullet"/>
+      </w:pPr>
+      <w:r>
+        <w:t>bits 7-5: green, 0-7;</w:t>
+      </w:r>
+    </w:p>
+    <w:p>
+      <w:pPr>
+        <w:pStyle w:val="ListBullet"/>
+      </w:pPr>
+      <w:r>
+        <w:t>bits 4-2: red, 0-7;</w:t>
+      </w:r>
+    </w:p>
+    <w:p>
+      <w:pPr>
+        <w:pStyle w:val="ListBullet"/>
+      </w:pPr>
+      <w:r>
+        <w:t>bits 1-0: blue, 0-3.</w:t>
+      </w:r>
+    </w:p>
+    <w:p>
+      <w:r>
+        <w:t>For example, this programs the first eight registers and enables ULAplus:</w:t>
+      </w:r>
+    </w:p>
+    <w:p>
+      <w:pPr>
+        <w:pStyle w:val="CodeBlock"/>
+        <w:shd w:fill="F2F4F7"/>
+      </w:pPr>
+      <w:r>
+        <w:t>PALETTE 0,0</w:t>
+        <w:br/>
+        <w:t>PALETTE 1,3</w:t>
+        <w:br/>
+        <w:t>PALETTE 2,28</w:t>
+        <w:br/>
+        <w:t>PALETTE 3,31</w:t>
+        <w:br/>
+        <w:t>PALETTE 4,224</w:t>
+        <w:br/>
+        <w:t>PALETTE 5,227</w:t>
+        <w:br/>
+        <w:t>PALETTE 6,252</w:t>
+        <w:br/>
+        <w:t>PALETTE 7,255</w:t>
+        <w:br/>
+        <w:t>ULAPLUS 1</w:t>
+      </w:r>
+    </w:p>
+    <w:p>
+      <w:r/>
+      <w:r>
+        <w:rPr>
+          <w:rStyle w:val="CodeInline"/>
+        </w:rPr>
+        <w:t>PALETTE</w:t>
+      </w:r>
+      <w:r>
+        <w:t xml:space="preserve"> stores register values whether ULAplus is currently enabled or not, so a program can prepare its colours first and then issue </w:t>
+      </w:r>
+      <w:r>
+        <w:rPr>
+          <w:rStyle w:val="CodeInline"/>
+        </w:rPr>
+        <w:t>ULAPLUS 1</w:t>
+      </w:r>
+      <w:r>
+        <w:t xml:space="preserve">. Issuing </w:t>
+      </w:r>
+      <w:r>
+        <w:rPr>
+          <w:rStyle w:val="CodeInline"/>
+        </w:rPr>
+        <w:t>ULAPLUS 0</w:t>
+      </w:r>
+      <w:r>
+        <w:t xml:space="preserve"> returns to the normal palette without erasing the programmed values; a later </w:t>
+      </w:r>
+      <w:r>
+        <w:rPr>
+          <w:rStyle w:val="CodeInline"/>
+        </w:rPr>
+        <w:t>ULAPLUS 1</w:t>
+      </w:r>
+      <w:r>
+        <w:t xml:space="preserve"> reuses them.</w:t>
+      </w:r>
+    </w:p>
+    <w:p>
+      <w:r>
+        <w:t xml:space="preserve">ULAplus is deliberately program-scoped. Every route back to the editor—normal completion, </w:t>
+      </w:r>
+      <w:r>
+        <w:rPr>
+          <w:rStyle w:val="CodeInline"/>
+        </w:rPr>
+        <w:t>END</w:t>
+      </w:r>
+      <w:r>
+        <w:t xml:space="preserve">, </w:t>
+      </w:r>
+      <w:r>
+        <w:rPr>
+          <w:rStyle w:val="CodeInline"/>
+        </w:rPr>
+        <w:t>STOP</w:t>
+      </w:r>
+      <w:r>
+        <w:t xml:space="preserve">, a runtime error, or </w:t>
+      </w:r>
+      <w:r>
+        <w:rPr>
+          <w:rStyle w:val="CodeInline"/>
+        </w:rPr>
+        <w:t>BREAK</w:t>
+      </w:r>
+      <w:r>
+        <w:t xml:space="preserve">—automatically disables ULAplus so the editor is always readable in the normal display mode. The programmed palette values remain available to the next </w:t>
+      </w:r>
+      <w:r>
+        <w:rPr>
+          <w:rStyle w:val="CodeInline"/>
+        </w:rPr>
+        <w:t>ULAPLUS 1</w:t>
+      </w:r>
+      <w:r>
+        <w:t xml:space="preserve"> during that session.</w:t>
+      </w:r>
+    </w:p>
+    <w:p>
+      <w:r>
+        <w:t xml:space="preserve">ULAplus works with the normal screen and with </w:t>
+      </w:r>
+      <w:r>
+        <w:rPr>
+          <w:rStyle w:val="CodeInline"/>
+        </w:rPr>
+        <w:t>MODE 1</w:t>
+      </w:r>
+      <w:r>
+        <w:t>; it is independent of the removed 64-column mode and its former TS2068 palette selector. Emulator support varies: ZEsarUX can enable ULAplus for the TS2068, while an unpatched upstream Fuse may not expose it for this machine.</w:t>
       </w:r>
     </w:p>
     <w:p>
@@ -8633,7 +8907,7 @@
               <w:rPr>
                 <w:rStyle w:val="CodeInline"/>
               </w:rPr>
-              <w:t>PAUSE</w:t>
+              <w:t>PALETTE</w:t>
             </w:r>
             <w:r/>
           </w:p>
@@ -8650,7 +8924,7 @@
                 <w:sz w:val="18"/>
                 <w:u w:val="single"/>
               </w:rPr>
-              <w:t>5</w:t>
+              <w:t>9</w:t>
             </w:r>
             <w:r/>
           </w:p>
@@ -8667,7 +8941,7 @@
               <w:rPr>
                 <w:rStyle w:val="CodeInline"/>
               </w:rPr>
-              <w:t>PLOT</w:t>
+              <w:t>PAUSE</w:t>
             </w:r>
             <w:r/>
           </w:p>
@@ -8684,7 +8958,7 @@
                 <w:sz w:val="18"/>
                 <w:u w:val="single"/>
               </w:rPr>
-              <w:t>9</w:t>
+              <w:t>5</w:t>
             </w:r>
             <w:r/>
           </w:p>
@@ -8701,7 +8975,7 @@
               <w:rPr>
                 <w:rStyle w:val="CodeInline"/>
               </w:rPr>
-              <w:t>POKE</w:t>
+              <w:t>PLOT</w:t>
             </w:r>
             <w:r/>
           </w:p>
@@ -8718,7 +8992,7 @@
                 <w:sz w:val="18"/>
                 <w:u w:val="single"/>
               </w:rPr>
-              <w:t>13</w:t>
+              <w:t>9</w:t>
             </w:r>
             <w:r/>
           </w:p>
@@ -8735,7 +9009,7 @@
               <w:rPr>
                 <w:rStyle w:val="CodeInline"/>
               </w:rPr>
-              <w:t>PRINT</w:t>
+              <w:t>POKE</w:t>
             </w:r>
             <w:r/>
           </w:p>
@@ -8752,7 +9026,7 @@
                 <w:sz w:val="18"/>
                 <w:u w:val="single"/>
               </w:rPr>
-              <w:t>8</w:t>
+              <w:t>13</w:t>
             </w:r>
             <w:r/>
           </w:p>
@@ -8769,7 +9043,7 @@
               <w:rPr>
                 <w:rStyle w:val="CodeInline"/>
               </w:rPr>
-              <w:t>RANDOMISE</w:t>
+              <w:t>PRINT</w:t>
             </w:r>
             <w:r/>
           </w:p>
@@ -8786,7 +9060,7 @@
                 <w:sz w:val="18"/>
                 <w:u w:val="single"/>
               </w:rPr>
-              <w:t>15</w:t>
+              <w:t>8</w:t>
             </w:r>
             <w:r/>
           </w:p>
@@ -8803,41 +9077,7 @@
               <w:rPr>
                 <w:rStyle w:val="CodeInline"/>
               </w:rPr>
-              <w:t>REM</w:t>
-            </w:r>
-            <w:r/>
-          </w:p>
-        </w:tc>
-        <w:tc>
-          <w:tcPr>
-            <w:tcW w:type="dxa" w:w="5040"/>
-          </w:tcPr>
-          <w:p>
-            <w:r>
-              <w:t xml:space="preserve">comment to end of line — </w:t>
-            </w:r>
-            <w:r>
-              <w:rPr>
-                <w:rStyle w:val="CodeInline"/>
-              </w:rPr>
-              <w:t>REM this is ignored</w:t>
-            </w:r>
-            <w:r/>
-          </w:p>
-        </w:tc>
-      </w:tr>
-      <w:tr>
-        <w:tc>
-          <w:tcPr>
-            <w:tcW w:type="dxa" w:w="5040"/>
-          </w:tcPr>
-          <w:p>
-            <w:r/>
-            <w:r>
-              <w:rPr>
-                <w:rStyle w:val="CodeInline"/>
-              </w:rPr>
-              <w:t>RUN</w:t>
+              <w:t>RANDOMISE</w:t>
             </w:r>
             <w:r/>
           </w:p>
@@ -8854,7 +9094,7 @@
                 <w:sz w:val="18"/>
                 <w:u w:val="single"/>
               </w:rPr>
-              <w:t>14</w:t>
+              <w:t>15</w:t>
             </w:r>
             <w:r/>
           </w:p>
@@ -8871,7 +9111,41 @@
               <w:rPr>
                 <w:rStyle w:val="CodeInline"/>
               </w:rPr>
-              <w:t>SAVE</w:t>
+              <w:t>REM</w:t>
+            </w:r>
+            <w:r/>
+          </w:p>
+        </w:tc>
+        <w:tc>
+          <w:tcPr>
+            <w:tcW w:type="dxa" w:w="5040"/>
+          </w:tcPr>
+          <w:p>
+            <w:r>
+              <w:t xml:space="preserve">comment to end of line — </w:t>
+            </w:r>
+            <w:r>
+              <w:rPr>
+                <w:rStyle w:val="CodeInline"/>
+              </w:rPr>
+              <w:t>REM this is ignored</w:t>
+            </w:r>
+            <w:r/>
+          </w:p>
+        </w:tc>
+      </w:tr>
+      <w:tr>
+        <w:tc>
+          <w:tcPr>
+            <w:tcW w:type="dxa" w:w="5040"/>
+          </w:tcPr>
+          <w:p>
+            <w:r/>
+            <w:r>
+              <w:rPr>
+                <w:rStyle w:val="CodeInline"/>
+              </w:rPr>
+              <w:t>RUN</w:t>
             </w:r>
             <w:r/>
           </w:p>
@@ -8888,7 +9162,7 @@
                 <w:sz w:val="18"/>
                 <w:u w:val="single"/>
               </w:rPr>
-              <w:t>3</w:t>
+              <w:t>14</w:t>
             </w:r>
             <w:r/>
           </w:p>
@@ -8905,7 +9179,7 @@
               <w:rPr>
                 <w:rStyle w:val="CodeInline"/>
               </w:rPr>
-              <w:t>SOUND</w:t>
+              <w:t>SAVE</w:t>
             </w:r>
             <w:r/>
           </w:p>
@@ -8922,7 +9196,7 @@
                 <w:sz w:val="18"/>
                 <w:u w:val="single"/>
               </w:rPr>
-              <w:t>11</w:t>
+              <w:t>3</w:t>
             </w:r>
             <w:r/>
           </w:p>
@@ -8939,34 +9213,7 @@
               <w:rPr>
                 <w:rStyle w:val="CodeInline"/>
               </w:rPr>
-              <w:t>SPRITE GRAB</w:t>
-            </w:r>
-            <w:r>
-              <w:t xml:space="preserve"> / </w:t>
-            </w:r>
-            <w:r>
-              <w:rPr>
-                <w:rStyle w:val="CodeInline"/>
-              </w:rPr>
-              <w:t>SHOW</w:t>
-            </w:r>
-            <w:r>
-              <w:t xml:space="preserve"> / </w:t>
-            </w:r>
-            <w:r>
-              <w:rPr>
-                <w:rStyle w:val="CodeInline"/>
-              </w:rPr>
-              <w:t>HIDE</w:t>
-            </w:r>
-            <w:r>
-              <w:t xml:space="preserve"> / </w:t>
-            </w:r>
-            <w:r>
-              <w:rPr>
-                <w:rStyle w:val="CodeInline"/>
-              </w:rPr>
-              <w:t>MOVE</w:t>
+              <w:t>SOUND</w:t>
             </w:r>
             <w:r/>
           </w:p>
@@ -8983,7 +9230,7 @@
                 <w:sz w:val="18"/>
                 <w:u w:val="single"/>
               </w:rPr>
-              <w:t>10</w:t>
+              <w:t>11</w:t>
             </w:r>
             <w:r/>
           </w:p>
@@ -9000,7 +9247,34 @@
               <w:rPr>
                 <w:rStyle w:val="CodeInline"/>
               </w:rPr>
-              <w:t>STOP</w:t>
+              <w:t>SPRITE GRAB</w:t>
+            </w:r>
+            <w:r>
+              <w:t xml:space="preserve"> / </w:t>
+            </w:r>
+            <w:r>
+              <w:rPr>
+                <w:rStyle w:val="CodeInline"/>
+              </w:rPr>
+              <w:t>SHOW</w:t>
+            </w:r>
+            <w:r>
+              <w:t xml:space="preserve"> / </w:t>
+            </w:r>
+            <w:r>
+              <w:rPr>
+                <w:rStyle w:val="CodeInline"/>
+              </w:rPr>
+              <w:t>HIDE</w:t>
+            </w:r>
+            <w:r>
+              <w:t xml:space="preserve"> / </w:t>
+            </w:r>
+            <w:r>
+              <w:rPr>
+                <w:rStyle w:val="CodeInline"/>
+              </w:rPr>
+              <w:t>MOVE</w:t>
             </w:r>
             <w:r/>
           </w:p>
@@ -9017,7 +9291,7 @@
                 <w:sz w:val="18"/>
                 <w:u w:val="single"/>
               </w:rPr>
-              <w:t>5</w:t>
+              <w:t>10</w:t>
             </w:r>
             <w:r/>
           </w:p>
@@ -9034,7 +9308,7 @@
               <w:rPr>
                 <w:rStyle w:val="CodeInline"/>
               </w:rPr>
-              <w:t>TAB</w:t>
+              <w:t>STOP</w:t>
             </w:r>
             <w:r/>
           </w:p>
@@ -9051,7 +9325,75 @@
                 <w:sz w:val="18"/>
                 <w:u w:val="single"/>
               </w:rPr>
+              <w:t>5</w:t>
+            </w:r>
+            <w:r/>
+          </w:p>
+        </w:tc>
+      </w:tr>
+      <w:tr>
+        <w:tc>
+          <w:tcPr>
+            <w:tcW w:type="dxa" w:w="5040"/>
+          </w:tcPr>
+          <w:p>
+            <w:r/>
+            <w:r>
+              <w:rPr>
+                <w:rStyle w:val="CodeInline"/>
+              </w:rPr>
+              <w:t>TAB</w:t>
+            </w:r>
+            <w:r/>
+          </w:p>
+        </w:tc>
+        <w:tc>
+          <w:tcPr>
+            <w:tcW w:type="dxa" w:w="5040"/>
+          </w:tcPr>
+          <w:p>
+            <w:r/>
+            <w:r>
+              <w:rPr>
+                <w:color w:val="1F4E79"/>
+                <w:sz w:val="18"/>
+                <w:u w:val="single"/>
+              </w:rPr>
               <w:t>8</w:t>
+            </w:r>
+            <w:r/>
+          </w:p>
+        </w:tc>
+      </w:tr>
+      <w:tr>
+        <w:tc>
+          <w:tcPr>
+            <w:tcW w:type="dxa" w:w="5040"/>
+          </w:tcPr>
+          <w:p>
+            <w:r/>
+            <w:r>
+              <w:rPr>
+                <w:rStyle w:val="CodeInline"/>
+              </w:rPr>
+              <w:t>ULAPLUS</w:t>
+            </w:r>
+            <w:r/>
+          </w:p>
+        </w:tc>
+        <w:tc>
+          <w:tcPr>
+            <w:tcW w:type="dxa" w:w="5040"/>
+          </w:tcPr>
+          <w:p>
+            <w:r/>
+            <w:r>
+              <w:rPr>
+                <w:color w:val="1F4E79"/>
+                <w:sz w:val="18"/>
+                <w:u w:val="single"/>
+              </w:rPr>
+              <w:t>9</w:t>
             </w:r>
             <w:r/>
           </w:p>

</xml_diff>